<commit_message>
feat(print): Geschäftsausstattung auf Gold-Markenfarbe umgestellt
Nach dem Brand-Identity-Audit (PR #192) ist Gold der tragende Marken-Akzent
(goldener Logo-Schriftzug) und die Basis ruhiges Anthrazit statt „kosmisch".
Visitenkarte, Briefpapier (PDF) und die Word-Vorlage ziehen jetzt nach:

- Wortmarke „GEDANKEN" in Gold: auf Dunkel Verlauf gold-300→gold-400
  (leuchtet), auf Hell tieferes Gold (gold-500→gold-700 bzw. gold-600/700
  solide, AA-tauglich).
- Akzente (Eyebrow/Tagline, Feinlinien, Web-Link, Rolle) auf Gold umgestellt;
  Kartengrund von kosmisch-bunt auf ruhiges Anthrazit mit warmem Gold-Schimmer.
- marke.mjs: neue Anthrazit-Navy-Werte + gold-300..700 (Spiegel aus globals.css).
- Optimiertes Emblem (public/email/wmdg-signatur-logo.png) aus der aktuellen
  Logo-Quelle neu erzeugt.
- Brandbook Kap. 07 Print-Farbregel auf Gold aktualisiert.

Co-Authored-By: Claude Opus 4.8 <noreply@anthropic.com>
Claude-Session: https://claude.ai/code/session_017ADpWozdCkf8oCMjoArAkE
</commit_message>
<xml_diff>
--- a/tools/print/out/WMDG-Briefpapier-Vorlage.docx
+++ b/tools/print/out/WMDG-Briefpapier-Vorlage.docx
@@ -213,7 +213,7 @@
   <w:p>
     <w:pPr>
       <w:pBdr>
-        <w:bottom w:val="single" w:color="34C4C4" w:sz="12" w:space="1"/>
+        <w:bottom w:val="single" w:color="A8842A" w:sz="12" w:space="1"/>
       </w:pBdr>
       <w:spacing w:after="0"/>
     </w:pPr>
@@ -379,7 +379,7 @@
           <w:r>
             <w:rPr>
               <w:rFonts w:ascii="Arial" w:cs="Arial" w:eastAsia="Arial" w:hAnsi="Arial"/>
-              <w:color w:val="3A7615"/>
+              <w:color w:val="7E6410"/>
               <w:sz w:val="15"/>
               <w:szCs w:val="15"/>
             </w:rPr>
@@ -599,7 +599,7 @@
               <w:rFonts w:ascii="Arial" w:cs="Arial" w:eastAsia="Arial" w:hAnsi="Arial"/>
               <w:b/>
               <w:bCs/>
-              <w:color w:val="3A7615"/>
+              <w:color w:val="A8842A"/>
               <w:spacing w:val="30"/>
               <w:sz w:val="40"/>
               <w:szCs w:val="40"/>
@@ -628,7 +628,7 @@
               <w:rFonts w:ascii="Arial" w:cs="Arial" w:eastAsia="Arial" w:hAnsi="Arial"/>
               <w:b/>
               <w:bCs/>
-              <w:color w:val="0F6D77"/>
+              <w:color w:val="7E6410"/>
               <w:spacing w:val="30"/>
               <w:sz w:val="17"/>
               <w:szCs w:val="17"/>
@@ -642,7 +642,7 @@
   <w:p>
     <w:pPr>
       <w:pBdr>
-        <w:bottom w:val="single" w:color="34C4C4" w:sz="12" w:space="1"/>
+        <w:bottom w:val="single" w:color="A8842A" w:sz="12" w:space="1"/>
       </w:pBdr>
       <w:spacing w:after="0" w:before="80"/>
     </w:pPr>

</xml_diff>

<commit_message>
feat(print): Original-Logo-Lockup (MEISTER gold) + Signatur auf Gold
Korrigiert die Wortmarke auf das Original-Logo: der goldene Schriftzug ist
„MEISTER" (nicht „GEDANKEN"). Alle Stücke bauen jetzt das Lockup nach –
„WERDE MEISTER" mit goldenem MEISTER über „DEINER GEDANKEN" (mit Goldstrichen):

- Visitenkarte (Vorder-/Rückseite), Briefpapier (PDF) und Word-Vorlage.
- Markenzeile mit goldenem „Meister" auf den Rückseiten/Fußzeilen.
- E-Mail-Signatur (hell + dunkel) auf Gold-Akzent umgestellt (Rolle, Links,
  Trennbalken, Markenzeile): auf Hell gold-700 (AA), auf Dunkel gold-300.
- lockup {pre, gold, sub} in marke.mjs als Single Source.
- README + Brandbook Kap. 07 nachgezogen.

Co-Authored-By: Claude Opus 4.8 <noreply@anthropic.com>
Claude-Session: https://claude.ai/code/session_017ADpWozdCkf8oCMjoArAkE
</commit_message>
<xml_diff>
--- a/tools/print/out/WMDG-Briefpapier-Vorlage.docx
+++ b/tools/print/out/WMDG-Briefpapier-Vorlage.docx
@@ -578,7 +578,7 @@
         </w:tcPr>
         <w:p>
           <w:pPr>
-            <w:spacing w:after="20"/>
+            <w:spacing w:after="30"/>
           </w:pPr>
           <w:r>
             <w:rPr>
@@ -587,24 +587,36 @@
               <w:bCs/>
               <w:color w:val="16231F"/>
               <w:spacing w:val="40"/>
-              <w:sz w:val="20"/>
-              <w:szCs w:val="20"/>
-            </w:rPr>
-            <w:t xml:space="preserve">WERDE MEISTER DEINER</w:t>
-          </w:r>
-        </w:p>
-        <w:p>
+              <w:sz w:val="30"/>
+              <w:szCs w:val="30"/>
+            </w:rPr>
+            <w:t xml:space="preserve">WERDE </w:t>
+          </w:r>
           <w:r>
             <w:rPr>
               <w:rFonts w:ascii="Arial" w:cs="Arial" w:eastAsia="Arial" w:hAnsi="Arial"/>
               <w:b/>
               <w:bCs/>
               <w:color w:val="A8842A"/>
-              <w:spacing w:val="30"/>
-              <w:sz w:val="40"/>
-              <w:szCs w:val="40"/>
-            </w:rPr>
-            <w:t xml:space="preserve">GEDANKEN</w:t>
+              <w:spacing w:val="40"/>
+              <w:sz w:val="30"/>
+              <w:szCs w:val="30"/>
+            </w:rPr>
+            <w:t xml:space="preserve">MEISTER</w:t>
+          </w:r>
+        </w:p>
+        <w:p>
+          <w:r>
+            <w:rPr>
+              <w:rFonts w:ascii="Arial" w:cs="Arial" w:eastAsia="Arial" w:hAnsi="Arial"/>
+              <w:b/>
+              <w:bCs/>
+              <w:color w:val="16231F"/>
+              <w:spacing w:val="60"/>
+              <w:sz w:val="16"/>
+              <w:szCs w:val="16"/>
+            </w:rPr>
+            <w:t xml:space="preserve">DEINER GEDANKEN</w:t>
           </w:r>
         </w:p>
       </w:tc>

</xml_diff>

<commit_message>
feat(print): echtes Logo als Bild in der Word-Vorlage
Word kann keinen Verlaufstext – bisher war „MEISTER" dort solide Gold. Jetzt
wird das vollständige Logo (goldenes Emblem + Wortmarke „WERDE MEISTER / DEINER
GEDANKEN" mit echtem Gold-Verlauf) einmal via Chromium in ein transparentes PNG
gerendert (tools/print/logo-lockup.mjs → public/email/wmdg-logo-lockup.png) und
als Bild in den Word-Kopf eingebettet. Damit sieht die Word-Vorlage 1:1 wie
Header/Briefbogen aus.

- package.json: npm run logo-lockup; README nachgezogen.

Co-Authored-By: Claude Opus 4.8 <noreply@anthropic.com>
Claude-Session: https://claude.ai/code/session_017ADpWozdCkf8oCMjoArAkE
</commit_message>
<xml_diff>
--- a/tools/print/out/WMDG-Briefpapier-Vorlage.docx
+++ b/tools/print/out/WMDG-Briefpapier-Vorlage.docx
@@ -503,14 +503,13 @@
       </w:tblBorders>
     </w:tblPr>
     <w:tblGrid>
-      <w:gridCol w:w="1200"/>
-      <w:gridCol w:w="5600"/>
-      <w:gridCol w:w="2554"/>
+      <w:gridCol w:w="6000"/>
+      <w:gridCol w:w="3354"/>
     </w:tblGrid>
     <w:tr>
       <w:tc>
         <w:tcPr>
-          <w:tcW w:type="dxa" w:w="1200"/>
+          <w:tcW w:type="dxa" w:w="6000"/>
           <w:tcBorders>
             <w:top w:val="none" w:color="auto" w:sz="0"/>
             <w:left w:val="none" w:color="auto" w:sz="0"/>
@@ -523,7 +522,7 @@
           <w:r>
             <w:drawing>
               <wp:inline distT="0" distB="0" distL="0" distR="0">
-                <wp:extent cx="571500" cy="571500"/>
+                <wp:extent cx="2657475" cy="628650"/>
                 <wp:effectExtent t="0" r="0" b="0" l="0"/>
                 <wp:docPr id="1" name="" descr="" title=""/>
                 <wp:cNvGraphicFramePr>
@@ -548,7 +547,7 @@
                       <pic:spPr bwMode="auto">
                         <a:xfrm>
                           <a:off x="0" y="0"/>
-                          <a:ext cx="571500" cy="571500"/>
+                          <a:ext cx="2657475" cy="628650"/>
                         </a:xfrm>
                         <a:prstGeom prst="rect">
                           <a:avLst/>
@@ -564,65 +563,7 @@
       </w:tc>
       <w:tc>
         <w:tcPr>
-          <w:tcW w:type="dxa" w:w="5600"/>
-          <w:tcBorders>
-            <w:top w:val="none" w:color="auto" w:sz="0"/>
-            <w:left w:val="none" w:color="auto" w:sz="0"/>
-            <w:bottom w:val="none" w:color="auto" w:sz="0"/>
-            <w:right w:val="none" w:color="auto" w:sz="0"/>
-          </w:tcBorders>
-          <w:tcMar>
-            <w:left w:type="dxa" w:w="120"/>
-          </w:tcMar>
-          <w:vAlign w:val="center"/>
-        </w:tcPr>
-        <w:p>
-          <w:pPr>
-            <w:spacing w:after="30"/>
-          </w:pPr>
-          <w:r>
-            <w:rPr>
-              <w:rFonts w:ascii="Arial" w:cs="Arial" w:eastAsia="Arial" w:hAnsi="Arial"/>
-              <w:b/>
-              <w:bCs/>
-              <w:color w:val="16231F"/>
-              <w:spacing w:val="40"/>
-              <w:sz w:val="30"/>
-              <w:szCs w:val="30"/>
-            </w:rPr>
-            <w:t xml:space="preserve">WERDE </w:t>
-          </w:r>
-          <w:r>
-            <w:rPr>
-              <w:rFonts w:ascii="Arial" w:cs="Arial" w:eastAsia="Arial" w:hAnsi="Arial"/>
-              <w:b/>
-              <w:bCs/>
-              <w:color w:val="A8842A"/>
-              <w:spacing w:val="40"/>
-              <w:sz w:val="30"/>
-              <w:szCs w:val="30"/>
-            </w:rPr>
-            <w:t xml:space="preserve">MEISTER</w:t>
-          </w:r>
-        </w:p>
-        <w:p>
-          <w:r>
-            <w:rPr>
-              <w:rFonts w:ascii="Arial" w:cs="Arial" w:eastAsia="Arial" w:hAnsi="Arial"/>
-              <w:b/>
-              <w:bCs/>
-              <w:color w:val="16231F"/>
-              <w:spacing w:val="60"/>
-              <w:sz w:val="16"/>
-              <w:szCs w:val="16"/>
-            </w:rPr>
-            <w:t xml:space="preserve">DEINER GEDANKEN</w:t>
-          </w:r>
-        </w:p>
-      </w:tc>
-      <w:tc>
-        <w:tcPr>
-          <w:tcW w:type="dxa" w:w="2554"/>
+          <w:tcW w:type="dxa" w:w="3354"/>
           <w:tcBorders>
             <w:top w:val="none" w:color="auto" w:sz="0"/>
             <w:left w:val="none" w:color="auto" w:sz="0"/>

</xml_diff>